<commit_message>
Guides v3.7 : choix du type de poste réservé à la personne en appréciation
Co-Authored-By: Claude Opus 5.5 <noreply@anthropic.com>
Claude-Session: https://claude.ai/code/session_01FRdAzq8p3F9gJJe5MA3G79
</commit_message>
<xml_diff>
--- a/sharepoint-html-kit/ETAT-DU-PROJET.docx
+++ b/sharepoint-html-kit/ETAT-DU-PROJET.docx
@@ -116,13 +116,13 @@
                 <w:bCs/>
                 <w:b/>
               </w:rPr>
-              <w:t xml:space="preserve">v3.6</w:t>
+              <w:t xml:space="preserve">v3.7</w:t>
             </w:r>
             <w:r>
               <w:t xml:space="preserve"> </w:t>
             </w:r>
             <w:r>
-              <w:t xml:space="preserve">: les 3 formulaires du 15 octobre 2026, affichage allégé, compatible SharePoint</w:t>
+              <w:t xml:space="preserve">: les 3 formulaires du 15 octobre 2026, affichage allégé, compatible SharePoint ; seule la personne en appréciation choisit le type de poste</w:t>
             </w:r>
           </w:p>
         </w:tc>
@@ -296,7 +296,7 @@
               <w:jc w:val="left"/>
             </w:pPr>
             <w:r>
-              <w:t xml:space="preserve">Après le test de la v3.6</w:t>
+              <w:t xml:space="preserve">Après le test de la v3.7</w:t>
             </w:r>
           </w:p>
         </w:tc>
@@ -503,7 +503,7 @@
               <w:rPr>
                 <w:rStyle w:val="VerbatimChar"/>
               </w:rPr>
-              <w:t xml:space="preserve">appreciation-cadres-v3.6.html</w:t>
+              <w:t xml:space="preserve">appreciation-cadres-v3.7.html</w:t>
             </w:r>
           </w:p>
         </w:tc>

</xml_diff>

<commit_message>
Appréciation v3.8 : tout faire dans SharePoint (dépôt par copier-coller)
Dans l'aperçu SharePoint, le dépôt ne télécharge plus de fichier : le contenu
est copié et collé dans la nouvelle colonne « Contenu » de Depot_Appreciations.
Avertissement si on ferme la page avec des changements non déposés.
Guides mis à jour (colonne à ajouter, deux façons de travailler, tests S1-S7).

Co-Authored-By: Claude Opus 5.5 <noreply@anthropic.com>
Claude-Session: https://claude.ai/code/session_01FRdAzq8p3F9gJJe5MA3G79
</commit_message>
<xml_diff>
--- a/sharepoint-html-kit/ETAT-DU-PROJET.docx
+++ b/sharepoint-html-kit/ETAT-DU-PROJET.docx
@@ -2,13 +2,13 @@
 <file path=word/document.xml><?xml version="1.0" encoding="utf-8"?>
 <w:document xmlns:w="http://schemas.openxmlformats.org/wordprocessingml/2006/main" xmlns:m="http://schemas.openxmlformats.org/officeDocument/2006/math" xmlns:r="http://schemas.openxmlformats.org/officeDocument/2006/relationships" xmlns:o="urn:schemas-microsoft-com:office:office" xmlns:v="urn:schemas-microsoft-com:vml" xmlns:w10="urn:schemas-microsoft-com:office:word" xmlns:a="http://schemas.openxmlformats.org/drawingml/2006/main" xmlns:pic="http://schemas.openxmlformats.org/drawingml/2006/picture" xmlns:wp="http://schemas.openxmlformats.org/drawingml/2006/wordprocessingDrawing">
   <w:body>
-    <w:bookmarkStart w:id="22" w:name="X88fb60b3d9c4b8ff5cd6e12253d19def75c14b7"/>
+    <w:bookmarkStart w:id="22" w:name="X73d28281e519c727da1cf5e1a3efb0b8ee199b8"/>
     <w:p>
       <w:pPr>
         <w:pStyle w:val="Heading1"/>
       </w:pPr>
       <w:r>
-        <w:t xml:space="preserve">État du projet « Appréciation de la contribution » — au 19 octobre 2026</w:t>
+        <w:t xml:space="preserve">État du projet « Appréciation de la contribution » — au 20 octobre 2026</w:t>
       </w:r>
     </w:p>
     <w:p>
@@ -116,7 +116,7 @@
                 <w:bCs/>
                 <w:b/>
               </w:rPr>
-              <w:t xml:space="preserve">v3.7</w:t>
+              <w:t xml:space="preserve">v3.8</w:t>
             </w:r>
             <w:r>
               <w:t xml:space="preserve"> </w:t>
@@ -160,7 +160,7 @@
               <w:jc w:val="left"/>
             </w:pPr>
             <w:r>
-              <w:t xml:space="preserve">✅ Bibliothèque « Appréciation de la contribution des cadres ». L’aperçu affiche l’application, mais bloque l’enregistrement et les téléchargements :</w:t>
+              <w:t xml:space="preserve">✅ Bibliothèque « Appréciation de la contribution des cadres ».</w:t>
             </w:r>
             <w:r>
               <w:t xml:space="preserve"> </w:t>
@@ -170,7 +170,13 @@
                 <w:bCs/>
                 <w:b/>
               </w:rPr>
-              <w:t xml:space="preserve">on travaille dans le fichier téléchargé</w:t>
+              <w:t xml:space="preserve">On peut tout faire dans SharePoint</w:t>
+            </w:r>
+            <w:r>
+              <w:t xml:space="preserve"> </w:t>
+            </w:r>
+            <w:r>
+              <w:t xml:space="preserve">(dépôt par copier-coller) ou sur le poste (fichier téléchargé)</w:t>
             </w:r>
           </w:p>
         </w:tc>
@@ -220,7 +226,23 @@
               <w:jc w:val="left"/>
             </w:pPr>
             <w:r>
-              <w:t xml:space="preserve">—</w:t>
+              <w:t xml:space="preserve">Ajouter la colonne</w:t>
+            </w:r>
+            <w:r>
+              <w:t xml:space="preserve"> </w:t>
+            </w:r>
+            <w:r>
+              <w:rPr>
+                <w:bCs/>
+                <w:b/>
+              </w:rPr>
+              <w:t xml:space="preserve">Contenu</w:t>
+            </w:r>
+            <w:r>
+              <w:t xml:space="preserve"> </w:t>
+            </w:r>
+            <w:r>
+              <w:t xml:space="preserve">(guide d’installation, section 2)</w:t>
             </w:r>
           </w:p>
         </w:tc>
@@ -296,7 +318,7 @@
               <w:jc w:val="left"/>
             </w:pPr>
             <w:r>
-              <w:t xml:space="preserve">Après le test de la v3.7</w:t>
+              <w:t xml:space="preserve">Après le test de la v3.8</w:t>
             </w:r>
           </w:p>
         </w:tc>
@@ -503,7 +525,7 @@
               <w:rPr>
                 <w:rStyle w:val="VerbatimChar"/>
               </w:rPr>
-              <w:t xml:space="preserve">appreciation-cadres-v3.7.html</w:t>
+              <w:t xml:space="preserve">appreciation-cadres-v3.8.html</w:t>
             </w:r>
           </w:p>
         </w:tc>

</xml_diff>

<commit_message>
Guide du flux « AC - Traiter un dépôt » (version pilote, mode test) et liste des tâches
Co-Authored-By: Claude Opus 5.5 <noreply@anthropic.com>
Claude-Session: https://claude.ai/code/session_01FRdAzq8p3F9gJJe5MA3G79
</commit_message>
<xml_diff>
--- a/sharepoint-html-kit/ETAT-DU-PROJET.docx
+++ b/sharepoint-html-kit/ETAT-DU-PROJET.docx
@@ -2,13 +2,13 @@
 <file path=word/document.xml><?xml version="1.0" encoding="utf-8"?>
 <w:document xmlns:w="http://schemas.openxmlformats.org/wordprocessingml/2006/main" xmlns:m="http://schemas.openxmlformats.org/officeDocument/2006/math" xmlns:r="http://schemas.openxmlformats.org/officeDocument/2006/relationships" xmlns:o="urn:schemas-microsoft-com:office:office" xmlns:v="urn:schemas-microsoft-com:vml" xmlns:w10="urn:schemas-microsoft-com:office:word" xmlns:a="http://schemas.openxmlformats.org/drawingml/2006/main" xmlns:pic="http://schemas.openxmlformats.org/drawingml/2006/picture" xmlns:wp="http://schemas.openxmlformats.org/drawingml/2006/wordprocessingDrawing">
   <w:body>
-    <w:bookmarkStart w:id="22" w:name="X73d28281e519c727da1cf5e1a3efb0b8ee199b8"/>
+    <w:bookmarkStart w:id="22" w:name="X89353666518d0ab40694a9e850fbb635aec2054"/>
     <w:p>
       <w:pPr>
         <w:pStyle w:val="Heading1"/>
       </w:pPr>
       <w:r>
-        <w:t xml:space="preserve">État du projet « Appréciation de la contribution » — au 20 octobre 2026</w:t>
+        <w:t xml:space="preserve">État du projet « Appréciation de la contribution » — au 21 octobre 2026</w:t>
       </w:r>
     </w:p>
     <w:p>
@@ -306,19 +306,19 @@
               <w:jc w:val="left"/>
             </w:pPr>
             <w:r>
-              <w:t xml:space="preserve">⬜ À construire</w:t>
-            </w:r>
-          </w:p>
-        </w:tc>
-        <w:tc>
-          <w:tcPr/>
-          <w:p>
-            <w:pPr>
-              <w:pStyle w:val="Compact"/>
-              <w:jc w:val="left"/>
-            </w:pPr>
-            <w:r>
-              <w:t xml:space="preserve">Après le test de la v3.8</w:t>
+              <w:t xml:space="preserve">⬜ À construire — guide prêt (5-GUIDE-FLUX-DEPOT), avec un mode test pour tout tester seule</w:t>
+            </w:r>
+          </w:p>
+        </w:tc>
+        <w:tc>
+          <w:tcPr/>
+          <w:p>
+            <w:pPr>
+              <w:pStyle w:val="Compact"/>
+              <w:jc w:val="left"/>
+            </w:pPr>
+            <w:r>
+              <w:t xml:space="preserve">Après le test du formulaire</w:t>
             </w:r>
           </w:p>
         </w:tc>
@@ -738,6 +738,53 @@
             </w:pPr>
             <w:r>
               <w:t xml:space="preserve">Ce qui a changé, version par version</w:t>
+            </w:r>
+          </w:p>
+        </w:tc>
+      </w:tr>
+      <w:tr>
+        <w:tc>
+          <w:tcPr/>
+          <w:p>
+            <w:pPr>
+              <w:pStyle w:val="Compact"/>
+              <w:jc w:val="left"/>
+            </w:pPr>
+            <w:r>
+              <w:rPr>
+                <w:rStyle w:val="VerbatimChar"/>
+              </w:rPr>
+              <w:t xml:space="preserve">5-GUIDE-FLUX-DEPOT</w:t>
+            </w:r>
+            <w:r>
+              <w:t xml:space="preserve"> </w:t>
+            </w:r>
+            <w:r>
+              <w:t xml:space="preserve">(.docx)</w:t>
+            </w:r>
+          </w:p>
+        </w:tc>
+        <w:tc>
+          <w:tcPr/>
+          <w:p>
+            <w:pPr>
+              <w:pStyle w:val="Compact"/>
+              <w:jc w:val="left"/>
+            </w:pPr>
+            <w:r>
+              <w:t xml:space="preserve">Vous</w:t>
+            </w:r>
+          </w:p>
+        </w:tc>
+        <w:tc>
+          <w:tcPr/>
+          <w:p>
+            <w:pPr>
+              <w:pStyle w:val="Compact"/>
+              <w:jc w:val="left"/>
+            </w:pPr>
+            <w:r>
+              <w:t xml:space="preserve">Construire et tester le flux Power Automate (version pilote)</w:t>
             </w:r>
           </w:p>
         </w:tc>

</xml_diff>